<commit_message>
updates to several WW demo programs for HNF
</commit_message>
<xml_diff>
--- a/Documentation/Whirlwind-Development-Environment.docx
+++ b/Documentation/Whirlwind-Development-Environment.docx
@@ -13860,10 +13860,758 @@
     <w:p/>
     <w:p>
       <w:pPr>
-        <w:pStyle w:val="Heading2"/>
+        <w:pStyle w:val="Heading3"/>
       </w:pPr>
       <w:bookmarkStart w:id="23" w:name="_Ref143087393"/>
       <w:bookmarkStart w:id="24" w:name="_Toc187018289"/>
+      <w:proofErr w:type="gramStart"/>
+      <w:r>
+        <w:t>.</w:t>
+      </w:r>
+      <w:proofErr w:type="spellStart"/>
+      <w:r>
+        <w:t>simparam</w:t>
+      </w:r>
+      <w:proofErr w:type="spellEnd"/>
+      <w:proofErr w:type="gramEnd"/>
+    </w:p>
+    <w:p/>
+    <w:p/>
+    <w:p>
+      <w:r>
+        <w:t>options:</w:t>
+      </w:r>
+    </w:p>
+    <w:p>
+      <w:r>
+        <w:t xml:space="preserve">  -h, --help            show this help message and exit</w:t>
+      </w:r>
+    </w:p>
+    <w:p>
+      <w:r>
+        <w:t xml:space="preserve">  --</w:t>
+      </w:r>
+      <w:proofErr w:type="spellStart"/>
+      <w:r>
+        <w:t>LogDir</w:t>
+      </w:r>
+      <w:proofErr w:type="spellEnd"/>
+      <w:r>
+        <w:t xml:space="preserve"> LOGDIR       Directory into which to store logs. Default is current wd.</w:t>
+      </w:r>
+    </w:p>
+    <w:p>
+      <w:r>
+        <w:t xml:space="preserve">  --</w:t>
+      </w:r>
+      <w:proofErr w:type="spellStart"/>
+      <w:r>
+        <w:t>ArchaeoLog</w:t>
+      </w:r>
+      <w:proofErr w:type="spellEnd"/>
+      <w:r>
+        <w:t xml:space="preserve">          Write data to the </w:t>
+      </w:r>
+      <w:proofErr w:type="spellStart"/>
+      <w:r>
+        <w:t>archaeolog</w:t>
+      </w:r>
+      <w:proofErr w:type="spellEnd"/>
+      <w:r>
+        <w:t xml:space="preserve"> dir.</w:t>
+      </w:r>
+    </w:p>
+    <w:p>
+      <w:r>
+        <w:t xml:space="preserve">  -t, --</w:t>
+      </w:r>
+      <w:proofErr w:type="spellStart"/>
+      <w:r>
+        <w:t>TracePC</w:t>
+      </w:r>
+      <w:proofErr w:type="spellEnd"/>
+      <w:r>
+        <w:t xml:space="preserve">         Trace PC for each instruction</w:t>
+      </w:r>
+    </w:p>
+    <w:p>
+      <w:r>
+        <w:t xml:space="preserve">  -a, --</w:t>
+      </w:r>
+      <w:proofErr w:type="spellStart"/>
+      <w:r>
+        <w:t>TraceALU</w:t>
+      </w:r>
+      <w:proofErr w:type="spellEnd"/>
+      <w:r>
+        <w:t xml:space="preserve">        Trace ALU for each instruction</w:t>
+      </w:r>
+    </w:p>
+    <w:p>
+      <w:r>
+        <w:t xml:space="preserve">  -f, --</w:t>
+      </w:r>
+      <w:proofErr w:type="spellStart"/>
+      <w:r>
+        <w:t>FlowGraph</w:t>
+      </w:r>
+      <w:proofErr w:type="spellEnd"/>
+      <w:r>
+        <w:t xml:space="preserve">       Collect data to make a flow graph. Default output file &lt;</w:t>
+      </w:r>
+      <w:proofErr w:type="spellStart"/>
+      <w:r>
+        <w:t>corefile</w:t>
+      </w:r>
+      <w:proofErr w:type="spellEnd"/>
+      <w:r>
+        <w:t>-base-name</w:t>
+      </w:r>
+      <w:proofErr w:type="gramStart"/>
+      <w:r>
+        <w:t>&gt;.</w:t>
+      </w:r>
+      <w:proofErr w:type="spellStart"/>
+      <w:r>
+        <w:t>flow</w:t>
+      </w:r>
+      <w:proofErr w:type="gramEnd"/>
+      <w:r>
+        <w:t>.gv</w:t>
+      </w:r>
+      <w:proofErr w:type="spellEnd"/>
+    </w:p>
+    <w:p>
+      <w:r>
+        <w:t xml:space="preserve">  -</w:t>
+      </w:r>
+      <w:proofErr w:type="spellStart"/>
+      <w:r>
+        <w:t>fo</w:t>
+      </w:r>
+      <w:proofErr w:type="spellEnd"/>
+      <w:r>
+        <w:t xml:space="preserve"> FLOWGRAPHOUTFILE, --</w:t>
+      </w:r>
+      <w:proofErr w:type="spellStart"/>
+      <w:r>
+        <w:t>FlowGraphOutFile</w:t>
+      </w:r>
+      <w:proofErr w:type="spellEnd"/>
+      <w:r>
+        <w:t xml:space="preserve"> FLOWGRAPHOUTFILE</w:t>
+      </w:r>
+    </w:p>
+    <w:p>
+      <w:r>
+        <w:t xml:space="preserve">                        Specify flow graph output file. Implies -f</w:t>
+      </w:r>
+    </w:p>
+    <w:p>
+      <w:r>
+        <w:t xml:space="preserve">  -</w:t>
+      </w:r>
+      <w:proofErr w:type="spellStart"/>
+      <w:r>
+        <w:t>fd</w:t>
+      </w:r>
+      <w:proofErr w:type="spellEnd"/>
+      <w:r>
+        <w:t xml:space="preserve"> FLOWGRAPHOUTDIR, --</w:t>
+      </w:r>
+      <w:proofErr w:type="spellStart"/>
+      <w:r>
+        <w:t>FlowGraphOutDir</w:t>
+      </w:r>
+      <w:proofErr w:type="spellEnd"/>
+      <w:r>
+        <w:t xml:space="preserve"> FLOWGRAPHOUTDIR</w:t>
+      </w:r>
+    </w:p>
+    <w:p>
+      <w:r>
+        <w:t xml:space="preserve">                        Specify flow graph output directory. Implies -f</w:t>
+      </w:r>
+    </w:p>
+    <w:p>
+      <w:r>
+        <w:t xml:space="preserve">  -j JUMPTO, --</w:t>
+      </w:r>
+      <w:proofErr w:type="spellStart"/>
+      <w:r>
+        <w:t>JumpTo</w:t>
+      </w:r>
+      <w:proofErr w:type="spellEnd"/>
+      <w:r>
+        <w:t xml:space="preserve"> JUMPTO</w:t>
+      </w:r>
+    </w:p>
+    <w:p>
+      <w:r>
+        <w:t xml:space="preserve">                        Sim Start Address in octal</w:t>
+      </w:r>
+    </w:p>
+    <w:p>
+      <w:r>
+        <w:t xml:space="preserve">  -q, --Quiet           Suppress run-time messages (</w:t>
+      </w:r>
+      <w:proofErr w:type="spellStart"/>
+      <w:r>
+        <w:t>nop</w:t>
+      </w:r>
+      <w:proofErr w:type="spellEnd"/>
+      <w:r>
+        <w:t xml:space="preserve"> -- here just for </w:t>
+      </w:r>
+      <w:proofErr w:type="spellStart"/>
+      <w:r>
+        <w:t>compat</w:t>
+      </w:r>
+      <w:proofErr w:type="spellEnd"/>
+      <w:r>
+        <w:t>)</w:t>
+      </w:r>
+    </w:p>
+    <w:p>
+      <w:r>
+        <w:t xml:space="preserve">  -v, --Verbose         Produce run-time messages</w:t>
+      </w:r>
+    </w:p>
+    <w:p>
+      <w:r>
+        <w:t xml:space="preserve">  --</w:t>
+      </w:r>
+      <w:proofErr w:type="spellStart"/>
+      <w:r>
+        <w:t>NoWarnings</w:t>
+      </w:r>
+      <w:proofErr w:type="spellEnd"/>
+      <w:r>
+        <w:t xml:space="preserve">          Suppress Warning messages</w:t>
+      </w:r>
+    </w:p>
+    <w:p>
+      <w:r>
+        <w:t xml:space="preserve">  -D, --</w:t>
+      </w:r>
+      <w:proofErr w:type="spellStart"/>
+      <w:r>
+        <w:t>DecimalAddresses</w:t>
+      </w:r>
+      <w:proofErr w:type="spellEnd"/>
+    </w:p>
+    <w:p>
+      <w:r>
+        <w:t xml:space="preserve">                        Display trace information in decimal (default is octal)</w:t>
+      </w:r>
+    </w:p>
+    <w:p>
+      <w:r>
+        <w:t xml:space="preserve">  -c CYCLELIMIT, --</w:t>
+      </w:r>
+      <w:proofErr w:type="spellStart"/>
+      <w:r>
+        <w:t>CycleLimit</w:t>
+      </w:r>
+      <w:proofErr w:type="spellEnd"/>
+      <w:r>
+        <w:t xml:space="preserve"> CYCLELIMIT</w:t>
+      </w:r>
+    </w:p>
+    <w:p>
+      <w:r>
+        <w:t xml:space="preserve">                        Specify how many instructions to run (zero-&gt;'forever')</w:t>
+      </w:r>
+    </w:p>
+    <w:p>
+      <w:r>
+        <w:t xml:space="preserve">  --</w:t>
+      </w:r>
+      <w:proofErr w:type="spellStart"/>
+      <w:r>
+        <w:t>CycleDelayTime</w:t>
+      </w:r>
+      <w:proofErr w:type="spellEnd"/>
+      <w:r>
+        <w:t xml:space="preserve"> CYCLEDELAYTIME</w:t>
+      </w:r>
+    </w:p>
+    <w:p>
+      <w:r>
+        <w:t xml:space="preserve">                        Specify how many msec delay to insert after each instruction</w:t>
+      </w:r>
+    </w:p>
+    <w:p>
+      <w:r>
+        <w:t xml:space="preserve">  --</w:t>
+      </w:r>
+      <w:proofErr w:type="spellStart"/>
+      <w:r>
+        <w:t>AnalogScope</w:t>
+      </w:r>
+      <w:proofErr w:type="spellEnd"/>
+      <w:r>
+        <w:t xml:space="preserve">         Display graphical output on an analog CRT</w:t>
+      </w:r>
+    </w:p>
+    <w:p>
+      <w:r>
+        <w:t xml:space="preserve">  --</w:t>
+      </w:r>
+      <w:proofErr w:type="spellStart"/>
+      <w:r>
+        <w:t>xWinSize</w:t>
+      </w:r>
+      <w:proofErr w:type="spellEnd"/>
+      <w:r>
+        <w:t xml:space="preserve"> XWINSIZE   specify the size of an </w:t>
+      </w:r>
+      <w:proofErr w:type="spellStart"/>
+      <w:r>
+        <w:t>xWinCrt</w:t>
+      </w:r>
+      <w:proofErr w:type="spellEnd"/>
+      <w:r>
+        <w:t xml:space="preserve"> pseudo-scope display in pixels</w:t>
+      </w:r>
+    </w:p>
+    <w:p>
+      <w:r>
+        <w:t xml:space="preserve">  --</w:t>
+      </w:r>
+      <w:proofErr w:type="spellStart"/>
+      <w:r>
+        <w:t>NoXWin</w:t>
+      </w:r>
+      <w:proofErr w:type="spellEnd"/>
+      <w:r>
+        <w:t xml:space="preserve">              Don't open any x-windows</w:t>
+      </w:r>
+    </w:p>
+    <w:p>
+      <w:r>
+        <w:lastRenderedPageBreak/>
+        <w:t xml:space="preserve">  --</w:t>
+      </w:r>
+      <w:proofErr w:type="spellStart"/>
+      <w:r>
+        <w:t>LongTraceFormat</w:t>
+      </w:r>
+      <w:proofErr w:type="spellEnd"/>
+      <w:r>
+        <w:t xml:space="preserve">     print all the </w:t>
+      </w:r>
+      <w:proofErr w:type="spellStart"/>
+      <w:r>
+        <w:t>cpu</w:t>
+      </w:r>
+      <w:proofErr w:type="spellEnd"/>
+      <w:r>
+        <w:t xml:space="preserve"> registers in </w:t>
+      </w:r>
+      <w:proofErr w:type="spellStart"/>
+      <w:r>
+        <w:t>TracePC</w:t>
+      </w:r>
+      <w:proofErr w:type="spellEnd"/>
+    </w:p>
+    <w:p>
+      <w:r>
+        <w:t xml:space="preserve">  --</w:t>
+      </w:r>
+      <w:proofErr w:type="spellStart"/>
+      <w:r>
+        <w:t>TraceCoreLocation</w:t>
+      </w:r>
+      <w:proofErr w:type="spellEnd"/>
+      <w:r>
+        <w:t xml:space="preserve"> TRACECORELOCATION</w:t>
+      </w:r>
+    </w:p>
+    <w:p>
+      <w:r>
+        <w:t xml:space="preserve">                        Trace references to Core Memory Location &lt;n&gt; octal</w:t>
+      </w:r>
+    </w:p>
+    <w:p>
+      <w:r>
+        <w:t xml:space="preserve">  --QuickStart          Don't wait for the Restart button on the control panel; just go!</w:t>
+      </w:r>
+    </w:p>
+    <w:p>
+      <w:r>
+        <w:t xml:space="preserve">  -n, --</w:t>
+      </w:r>
+      <w:proofErr w:type="spellStart"/>
+      <w:r>
+        <w:t>NoCloseOnStop</w:t>
+      </w:r>
+      <w:proofErr w:type="spellEnd"/>
+      <w:r>
+        <w:t xml:space="preserve">   Don't close the display on halt</w:t>
+      </w:r>
+    </w:p>
+    <w:p>
+      <w:r>
+        <w:t xml:space="preserve">  -p, --Panel           Pop up a Whirlwind Manual Intervention Panel window</w:t>
+      </w:r>
+    </w:p>
+    <w:p>
+      <w:r>
+        <w:t xml:space="preserve">  -b, --</w:t>
+      </w:r>
+      <w:proofErr w:type="spellStart"/>
+      <w:r>
+        <w:t>BlinkenLights</w:t>
+      </w:r>
+      <w:proofErr w:type="spellEnd"/>
+      <w:r>
+        <w:t xml:space="preserve">   Activate a physical Whirlwind Manual Intervention Panel</w:t>
+      </w:r>
+    </w:p>
+    <w:p>
+      <w:r>
+        <w:t xml:space="preserve">  -m, --</w:t>
+      </w:r>
+      <w:proofErr w:type="spellStart"/>
+      <w:proofErr w:type="gramStart"/>
+      <w:r>
+        <w:t>MicroWhirlwind</w:t>
+      </w:r>
+      <w:proofErr w:type="spellEnd"/>
+      <w:r>
+        <w:t xml:space="preserve">  Activate</w:t>
+      </w:r>
+      <w:proofErr w:type="gramEnd"/>
+      <w:r>
+        <w:t xml:space="preserve"> the </w:t>
+      </w:r>
+      <w:proofErr w:type="spellStart"/>
+      <w:r>
+        <w:t>MicroWhirlwind</w:t>
+      </w:r>
+      <w:proofErr w:type="spellEnd"/>
+      <w:r>
+        <w:t xml:space="preserve"> Model</w:t>
+      </w:r>
+    </w:p>
+    <w:p>
+      <w:r>
+        <w:t xml:space="preserve">  --</w:t>
+      </w:r>
+      <w:proofErr w:type="spellStart"/>
+      <w:r>
+        <w:t>SynchronousVideo</w:t>
+      </w:r>
+      <w:proofErr w:type="spellEnd"/>
+      <w:r>
+        <w:t xml:space="preserve">    Display pixels immediately; Disable video caching buffer</w:t>
+      </w:r>
+    </w:p>
+    <w:p>
+      <w:r>
+        <w:t xml:space="preserve">  --</w:t>
+      </w:r>
+      <w:proofErr w:type="spellStart"/>
+      <w:r>
+        <w:t>DumpCoreToFile</w:t>
+      </w:r>
+      <w:proofErr w:type="spellEnd"/>
+      <w:r>
+        <w:t xml:space="preserve"> DUMPCORETOFILE</w:t>
+      </w:r>
+    </w:p>
+    <w:p>
+      <w:r>
+        <w:t xml:space="preserve">                        Dump the contents of core into the named file at end of run</w:t>
+      </w:r>
+    </w:p>
+    <w:p>
+      <w:r>
+        <w:t xml:space="preserve">  --</w:t>
+      </w:r>
+      <w:proofErr w:type="spellStart"/>
+      <w:r>
+        <w:t>RestoreCoreFromFile</w:t>
+      </w:r>
+      <w:proofErr w:type="spellEnd"/>
+      <w:r>
+        <w:t xml:space="preserve"> RESTORECOREFROMFILE</w:t>
+      </w:r>
+    </w:p>
+    <w:p>
+      <w:r>
+        <w:t xml:space="preserve">                        Restore contents of memory from a core dump file</w:t>
+      </w:r>
+    </w:p>
+    <w:p>
+      <w:r>
+        <w:t xml:space="preserve">  --</w:t>
+      </w:r>
+      <w:proofErr w:type="spellStart"/>
+      <w:r>
+        <w:t>DrumStateFile</w:t>
+      </w:r>
+      <w:proofErr w:type="spellEnd"/>
+      <w:r>
+        <w:t xml:space="preserve"> DRUMSTATEFILE</w:t>
+      </w:r>
+    </w:p>
+    <w:p>
+      <w:r>
+        <w:t xml:space="preserve">                        File to store Persistent state for WW Drum</w:t>
+      </w:r>
+    </w:p>
+    <w:p>
+      <w:r>
+        <w:t xml:space="preserve">  --</w:t>
+      </w:r>
+      <w:proofErr w:type="spellStart"/>
+      <w:r>
+        <w:t>MuseumMode</w:t>
+      </w:r>
+      <w:proofErr w:type="spellEnd"/>
+      <w:r>
+        <w:t xml:space="preserve">          Cycle through states endlessly for museum display</w:t>
+      </w:r>
+    </w:p>
+    <w:p>
+      <w:r>
+        <w:t xml:space="preserve">  --</w:t>
+      </w:r>
+      <w:proofErr w:type="spellStart"/>
+      <w:r>
+        <w:t>HnfProgramDispatcher</w:t>
+      </w:r>
+      <w:proofErr w:type="spellEnd"/>
+    </w:p>
+    <w:p>
+      <w:r>
+        <w:t xml:space="preserve">                        Activate the special-purpose Demo Program Dispatcher for use at HNF</w:t>
+      </w:r>
+    </w:p>
+    <w:p>
+      <w:r>
+        <w:t xml:space="preserve">  -d, --Debugger        Start simulation under the debugger</w:t>
+      </w:r>
+    </w:p>
+    <w:p>
+      <w:r>
+        <w:t xml:space="preserve">  -map, --</w:t>
+      </w:r>
+      <w:proofErr w:type="spellStart"/>
+      <w:r>
+        <w:t>MemoryMap</w:t>
+      </w:r>
+      <w:proofErr w:type="spellEnd"/>
+      <w:r>
+        <w:t xml:space="preserve">     Produce a memory map (.map) file of the access types during this run</w:t>
+      </w:r>
+    </w:p>
+    <w:p>
+      <w:r>
+        <w:t xml:space="preserve">  --</w:t>
+      </w:r>
+      <w:proofErr w:type="spellStart"/>
+      <w:r>
+        <w:t>TTYname</w:t>
+      </w:r>
+      <w:proofErr w:type="spellEnd"/>
+      <w:r>
+        <w:t xml:space="preserve"> TTYNAME     Configure TTY name to access external media controller</w:t>
+      </w:r>
+    </w:p>
+    <w:p/>
+    <w:p>
+      <w:r>
+        <w:t xml:space="preserve">These are ones that I tinker with while debugging tapes, are not normally needed, but once in a while a program requires, or at least, always uses the arg.  </w:t>
+      </w:r>
+      <w:proofErr w:type="gramStart"/>
+      <w:r>
+        <w:t>So</w:t>
+      </w:r>
+      <w:proofErr w:type="gramEnd"/>
+      <w:r>
+        <w:t xml:space="preserve"> I’d keep the </w:t>
+      </w:r>
+      <w:proofErr w:type="spellStart"/>
+      <w:r>
+        <w:t>cmd</w:t>
+      </w:r>
+      <w:proofErr w:type="spellEnd"/>
+      <w:r>
+        <w:t xml:space="preserve"> line but also add a </w:t>
+      </w:r>
+      <w:proofErr w:type="spellStart"/>
+      <w:r>
+        <w:t>simparam</w:t>
+      </w:r>
+      <w:proofErr w:type="spellEnd"/>
+    </w:p>
+    <w:p>
+      <w:r>
+        <w:t xml:space="preserve">  --</w:t>
+      </w:r>
+      <w:proofErr w:type="spellStart"/>
+      <w:r>
+        <w:t>FlexoWin</w:t>
+      </w:r>
+      <w:proofErr w:type="spellEnd"/>
+      <w:r>
+        <w:t xml:space="preserve">            Display </w:t>
+      </w:r>
+      <w:proofErr w:type="spellStart"/>
+      <w:r>
+        <w:t>Flexowriter</w:t>
+      </w:r>
+      <w:proofErr w:type="spellEnd"/>
+      <w:r>
+        <w:t xml:space="preserve"> output in its own window</w:t>
+      </w:r>
+    </w:p>
+    <w:p>
+      <w:r>
+        <w:t xml:space="preserve">  --</w:t>
+      </w:r>
+      <w:proofErr w:type="spellStart"/>
+      <w:r>
+        <w:t>PETRAfile</w:t>
+      </w:r>
+      <w:proofErr w:type="spellEnd"/>
+      <w:r>
+        <w:t xml:space="preserve"> PETRAFILE</w:t>
+      </w:r>
+    </w:p>
+    <w:p>
+      <w:r>
+        <w:t xml:space="preserve">                        File name for photoelectric paper tape reader A input file</w:t>
+      </w:r>
+    </w:p>
+    <w:p>
+      <w:r>
+        <w:t xml:space="preserve">  --</w:t>
+      </w:r>
+      <w:proofErr w:type="spellStart"/>
+      <w:r>
+        <w:t>PETRBfile</w:t>
+      </w:r>
+      <w:proofErr w:type="spellEnd"/>
+      <w:r>
+        <w:t xml:space="preserve"> PETRBFILE</w:t>
+      </w:r>
+    </w:p>
+    <w:p>
+      <w:r>
+        <w:t xml:space="preserve">                        File name for photoelectric paper tape reader B input file</w:t>
+      </w:r>
+    </w:p>
+    <w:p>
+      <w:r>
+        <w:t xml:space="preserve">  --</w:t>
+      </w:r>
+      <w:proofErr w:type="spellStart"/>
+      <w:r>
+        <w:t>NoAlarmStop</w:t>
+      </w:r>
+      <w:proofErr w:type="spellEnd"/>
+      <w:r>
+        <w:t xml:space="preserve">         Don't stop on alarms</w:t>
+      </w:r>
+    </w:p>
+    <w:p>
+      <w:r>
+        <w:t xml:space="preserve">  --</w:t>
+      </w:r>
+      <w:proofErr w:type="spellStart"/>
+      <w:r>
+        <w:t>ZeroizeCore</w:t>
+      </w:r>
+      <w:proofErr w:type="spellEnd"/>
+      <w:r>
+        <w:t xml:space="preserve">         Return zero for uninitialized core memory</w:t>
+      </w:r>
+    </w:p>
+    <w:p/>
+    <w:p>
+      <w:r>
+        <w:t>These seem like they should only appear in the core file.</w:t>
+      </w:r>
+    </w:p>
+    <w:p>
+      <w:r>
+        <w:t xml:space="preserve">  -r, --Radar           Incorporate Radar Data Source</w:t>
+      </w:r>
+    </w:p>
+    <w:p>
+      <w:r>
+        <w:t xml:space="preserve">  --</w:t>
+      </w:r>
+      <w:proofErr w:type="spellStart"/>
+      <w:r>
+        <w:t>AutoClick</w:t>
+      </w:r>
+      <w:proofErr w:type="spellEnd"/>
+      <w:r>
+        <w:t xml:space="preserve">           Execute pre-programmed mouse clicks during simulation</w:t>
+      </w:r>
+    </w:p>
+    <w:p>
+      <w:r>
+        <w:lastRenderedPageBreak/>
+        <w:t xml:space="preserve">  --</w:t>
+      </w:r>
+      <w:proofErr w:type="spellStart"/>
+      <w:r>
+        <w:t>NoToggleSwitchWarning</w:t>
+      </w:r>
+      <w:proofErr w:type="spellEnd"/>
+    </w:p>
+    <w:p>
+      <w:r>
+        <w:t xml:space="preserve">                        Suppress warning if WW code writes a read-only toggle switch</w:t>
+      </w:r>
+    </w:p>
+    <w:p>
+      <w:r>
+        <w:t xml:space="preserve">  --</w:t>
+      </w:r>
+      <w:proofErr w:type="spellStart"/>
+      <w:r>
+        <w:t>NoZeroOneTSR</w:t>
+      </w:r>
+      <w:proofErr w:type="spellEnd"/>
+      <w:r>
+        <w:t xml:space="preserve">        Don't automatically return 0 and 1 for locations 0 and 1</w:t>
+      </w:r>
+    </w:p>
+    <w:p>
+      <w:r>
+        <w:t xml:space="preserve">  --</w:t>
+      </w:r>
+      <w:proofErr w:type="spellStart"/>
+      <w:r>
+        <w:t>CrtFadeDelay</w:t>
+      </w:r>
+      <w:proofErr w:type="spellEnd"/>
+      <w:r>
+        <w:t xml:space="preserve"> CRTFADEDELAY</w:t>
+      </w:r>
+    </w:p>
+    <w:p>
+      <w:r>
+        <w:t xml:space="preserve">                        Configure Phosphor fade delay (default=0)</w:t>
+      </w:r>
+    </w:p>
+    <w:p/>
+    <w:p/>
+    <w:p/>
+    <w:p/>
+    <w:p/>
+    <w:p/>
+    <w:p>
+      <w:pPr>
+        <w:pStyle w:val="Heading2"/>
+      </w:pPr>
       <w:r>
         <w:t>Listing and Source File</w:t>
       </w:r>
@@ -15988,6 +16736,7 @@
         </w:numPr>
       </w:pPr>
       <w:r>
+        <w:lastRenderedPageBreak/>
         <w:t xml:space="preserve">Run a binary object </w:t>
       </w:r>
       <w:proofErr w:type="gramStart"/>
@@ -16140,7 +16889,6 @@
         </w:numPr>
       </w:pPr>
       <w:r>
-        <w:lastRenderedPageBreak/>
         <w:t xml:space="preserve">Keep editing the </w:t>
       </w:r>
       <w:proofErr w:type="gramStart"/>
@@ -16620,6 +17368,7 @@
         <w:rPr>
           <w:rFonts w:ascii="Consolas" w:hAnsi="Consolas"/>
         </w:rPr>
+        <w:lastRenderedPageBreak/>
         <w:t xml:space="preserve">@C0000: 0000000 0000001 0000000 </w:t>
       </w:r>
       <w:proofErr w:type="gramStart"/>
@@ -16745,723 +17494,723 @@
         <w:rPr>
           <w:rFonts w:ascii="Consolas" w:hAnsi="Consolas"/>
         </w:rPr>
+        <w:t xml:space="preserve">@S0300: </w:t>
+      </w:r>
+      <w:proofErr w:type="spellStart"/>
+      <w:r>
+        <w:rPr>
+          <w:rFonts w:ascii="Consolas" w:hAnsi="Consolas"/>
+        </w:rPr>
+        <w:t>do_dot</w:t>
+      </w:r>
+      <w:proofErr w:type="spellEnd"/>
+    </w:p>
+    <w:p>
+      <w:pPr>
+        <w:rPr>
+          <w:rFonts w:ascii="Consolas" w:hAnsi="Consolas"/>
+        </w:rPr>
+      </w:pPr>
+      <w:r>
+        <w:rPr>
+          <w:rFonts w:ascii="Consolas" w:hAnsi="Consolas"/>
+        </w:rPr>
+        <w:t>@S0500: u0500</w:t>
+      </w:r>
+    </w:p>
+    <w:p>
+      <w:pPr>
+        <w:rPr>
+          <w:rFonts w:ascii="Consolas" w:hAnsi="Consolas"/>
+        </w:rPr>
+      </w:pPr>
+      <w:r>
+        <w:rPr>
+          <w:rFonts w:ascii="Consolas" w:hAnsi="Consolas"/>
+        </w:rPr>
+        <w:t xml:space="preserve">@S0501: </w:t>
+      </w:r>
+      <w:proofErr w:type="spellStart"/>
+      <w:r>
+        <w:rPr>
+          <w:rFonts w:ascii="Consolas" w:hAnsi="Consolas"/>
+        </w:rPr>
+        <w:t>chr_cnt</w:t>
+      </w:r>
+      <w:proofErr w:type="spellEnd"/>
+    </w:p>
+    <w:p>
+      <w:pPr>
+        <w:rPr>
+          <w:rFonts w:ascii="Consolas" w:hAnsi="Consolas"/>
+        </w:rPr>
+      </w:pPr>
+    </w:p>
+    <w:p>
+      <w:pPr>
+        <w:rPr>
+          <w:rFonts w:ascii="Consolas" w:hAnsi="Consolas"/>
+        </w:rPr>
+      </w:pPr>
+      <w:r>
+        <w:rPr>
+          <w:rFonts w:ascii="Consolas" w:hAnsi="Consolas"/>
+        </w:rPr>
+        <w:t>@N0040: load constant 0o12 into AC</w:t>
+      </w:r>
+    </w:p>
+    <w:p>
+      <w:pPr>
+        <w:rPr>
+          <w:rFonts w:ascii="Consolas" w:hAnsi="Consolas"/>
+        </w:rPr>
+      </w:pPr>
+      <w:r>
+        <w:rPr>
+          <w:rFonts w:ascii="Consolas" w:hAnsi="Consolas"/>
+        </w:rPr>
+        <w:t xml:space="preserve">@N0041: Store it in </w:t>
+      </w:r>
+      <w:proofErr w:type="gramStart"/>
+      <w:r>
+        <w:rPr>
+          <w:rFonts w:ascii="Consolas" w:hAnsi="Consolas"/>
+        </w:rPr>
+        <w:t>a</w:t>
+      </w:r>
+      <w:proofErr w:type="gramEnd"/>
+      <w:r>
+        <w:rPr>
+          <w:rFonts w:ascii="Consolas" w:hAnsi="Consolas"/>
+        </w:rPr>
+        <w:t xml:space="preserve"> FF Reg(??)</w:t>
+      </w:r>
+    </w:p>
+    <w:p>
+      <w:pPr>
+        <w:rPr>
+          <w:rFonts w:ascii="Consolas" w:hAnsi="Consolas"/>
+        </w:rPr>
+      </w:pPr>
+      <w:r>
+        <w:rPr>
+          <w:rFonts w:ascii="Consolas" w:hAnsi="Consolas"/>
+        </w:rPr>
+        <w:t>@N0042: load constant 0o140510 into AC</w:t>
+      </w:r>
+    </w:p>
+    <w:p>
+      <w:pPr>
+        <w:rPr>
+          <w:rFonts w:ascii="Consolas" w:hAnsi="Consolas"/>
+        </w:rPr>
+      </w:pPr>
+    </w:p>
+    <w:p>
+      <w:pPr>
+        <w:rPr>
+          <w:rFonts w:ascii="Consolas" w:hAnsi="Consolas"/>
+        </w:rPr>
+      </w:pPr>
+      <w:r>
+        <w:rPr>
+          <w:rFonts w:ascii="Consolas" w:hAnsi="Consolas"/>
+        </w:rPr>
+        <w:t>@E0042: print: "execute .print" ["1", "2"]</w:t>
+      </w:r>
+    </w:p>
+    <w:p>
+      <w:pPr>
+        <w:rPr>
+          <w:rFonts w:ascii="Consolas" w:hAnsi="Consolas"/>
+        </w:rPr>
+      </w:pPr>
+      <w:r>
+        <w:rPr>
+          <w:rFonts w:ascii="Consolas" w:hAnsi="Consolas"/>
+        </w:rPr>
+        <w:t xml:space="preserve">@E0043: exec: if True: </w:t>
+      </w:r>
+      <w:proofErr w:type="gramStart"/>
+      <w:r>
+        <w:rPr>
+          <w:rFonts w:ascii="Consolas" w:hAnsi="Consolas"/>
+        </w:rPr>
+        <w:t>print(</w:t>
+      </w:r>
+      <w:proofErr w:type="gramEnd"/>
+      <w:r>
+        <w:rPr>
+          <w:rFonts w:ascii="Consolas" w:hAnsi="Consolas"/>
+        </w:rPr>
+        <w:t>"</w:t>
+      </w:r>
+      <w:proofErr w:type="gramStart"/>
+      <w:r>
+        <w:rPr>
+          <w:rFonts w:ascii="Consolas" w:hAnsi="Consolas"/>
+        </w:rPr>
+        <w:t>executed .exec</w:t>
+      </w:r>
+      <w:proofErr w:type="gramEnd"/>
+      <w:r>
+        <w:rPr>
+          <w:rFonts w:ascii="Consolas" w:hAnsi="Consolas"/>
+        </w:rPr>
+        <w:t>")</w:t>
+      </w:r>
+    </w:p>
+    <w:p>
+      <w:pPr>
+        <w:rPr>
+          <w:rFonts w:ascii="Consolas" w:hAnsi="Consolas"/>
+        </w:rPr>
+      </w:pPr>
+    </w:p>
+    <w:p>
+      <w:pPr>
+        <w:pStyle w:val="Heading2"/>
+      </w:pPr>
+      <w:bookmarkStart w:id="29" w:name="_Toc187018292"/>
+      <w:r>
+        <w:t>Assembler Grammar</w:t>
+      </w:r>
+      <w:bookmarkEnd w:id="29"/>
+    </w:p>
+    <w:p>
+      <w:pPr>
+        <w:rPr>
+          <w:rFonts w:ascii="Consolas" w:hAnsi="Consolas"/>
+        </w:rPr>
+      </w:pPr>
+      <w:r>
+        <w:rPr>
+          <w:rFonts w:ascii="Consolas" w:hAnsi="Consolas"/>
+        </w:rPr>
+        <w:t xml:space="preserve">The tokenizer and parser in wwasmparser.py follow this grammar fairly well, but there are probably a few spots where it doesn't line up. The code version wins unless it's shown to be some kind of error. Something not captured well </w:t>
+      </w:r>
+      <w:r>
+        <w:rPr>
+          <w:rFonts w:ascii="Consolas" w:hAnsi="Consolas"/>
+        </w:rPr>
+        <w:t xml:space="preserve">in this grammar </w:t>
+      </w:r>
+      <w:r>
+        <w:rPr>
+          <w:rFonts w:ascii="Consolas" w:hAnsi="Consolas"/>
+        </w:rPr>
+        <w:t xml:space="preserve">is some special casing needed </w:t>
+      </w:r>
+      <w:proofErr w:type="gramStart"/>
+      <w:r>
+        <w:rPr>
+          <w:rFonts w:ascii="Consolas" w:hAnsi="Consolas"/>
+        </w:rPr>
+        <w:t>for .</w:t>
+      </w:r>
+      <w:proofErr w:type="gramEnd"/>
+      <w:r>
+        <w:rPr>
+          <w:rFonts w:ascii="Consolas" w:hAnsi="Consolas"/>
+        </w:rPr>
+        <w:t>exec.</w:t>
+      </w:r>
+    </w:p>
+    <w:p>
+      <w:pPr>
+        <w:rPr>
+          <w:rFonts w:ascii="Consolas" w:hAnsi="Consolas"/>
+        </w:rPr>
+      </w:pPr>
+      <w:r>
+        <w:rPr>
+          <w:rFonts w:ascii="Consolas" w:hAnsi="Consolas"/>
+        </w:rPr>
+        <w:t xml:space="preserve">Note that the grammar tries to capture the nuances of number denotation, but in the </w:t>
+      </w:r>
+      <w:proofErr w:type="gramStart"/>
+      <w:r>
+        <w:rPr>
+          <w:rFonts w:ascii="Consolas" w:hAnsi="Consolas"/>
+        </w:rPr>
+        <w:t>code</w:t>
+      </w:r>
+      <w:proofErr w:type="gramEnd"/>
+      <w:r>
+        <w:rPr>
+          <w:rFonts w:ascii="Consolas" w:hAnsi="Consolas"/>
+        </w:rPr>
+        <w:t xml:space="preserve"> we use dot (".") as an operator and distinguish the number types in eval. This frees us from having to add lexical knowledge of those number forms.</w:t>
+      </w:r>
+    </w:p>
+    <w:p>
+      <w:pPr>
+        <w:rPr>
+          <w:rFonts w:ascii="Consolas" w:hAnsi="Consolas"/>
+        </w:rPr>
+      </w:pPr>
+      <w:r>
+        <w:rPr>
+          <w:rFonts w:ascii="Consolas" w:hAnsi="Consolas"/>
+        </w:rPr>
+        <w:t xml:space="preserve">Informal grammar of </w:t>
+      </w:r>
+      <w:r>
+        <w:rPr>
+          <w:rFonts w:ascii="Consolas" w:hAnsi="Consolas"/>
+        </w:rPr>
+        <w:t xml:space="preserve">a </w:t>
+      </w:r>
+      <w:r>
+        <w:rPr>
+          <w:rFonts w:ascii="Consolas" w:hAnsi="Consolas"/>
+        </w:rPr>
+        <w:t>single line, showing what's optional:</w:t>
+      </w:r>
+    </w:p>
+    <w:p>
+      <w:pPr>
+        <w:rPr>
+          <w:rFonts w:ascii="Consolas" w:hAnsi="Consolas"/>
+        </w:rPr>
+      </w:pPr>
+    </w:p>
+    <w:p>
+      <w:pPr>
+        <w:rPr>
+          <w:rFonts w:ascii="Consolas" w:hAnsi="Consolas"/>
+        </w:rPr>
+      </w:pPr>
+      <w:r>
+        <w:rPr>
+          <w:rFonts w:ascii="Consolas" w:hAnsi="Consolas"/>
+        </w:rPr>
+        <w:t>&lt;line&gt; = [@ &lt;oct&gt; [. &lt;dec&gt;</w:t>
+      </w:r>
+      <w:proofErr w:type="gramStart"/>
+      <w:r>
+        <w:rPr>
+          <w:rFonts w:ascii="Consolas" w:hAnsi="Consolas"/>
+        </w:rPr>
+        <w:t>] :</w:t>
+      </w:r>
+      <w:proofErr w:type="gramEnd"/>
+      <w:r>
+        <w:rPr>
+          <w:rFonts w:ascii="Consolas" w:hAnsi="Consolas"/>
+        </w:rPr>
+        <w:t xml:space="preserve"> &lt;oct&gt; &lt;</w:t>
+      </w:r>
+      <w:proofErr w:type="spellStart"/>
+      <w:r>
+        <w:rPr>
+          <w:rFonts w:ascii="Consolas" w:hAnsi="Consolas"/>
+        </w:rPr>
+        <w:t>sp</w:t>
+      </w:r>
+      <w:proofErr w:type="spellEnd"/>
+      <w:r>
+        <w:rPr>
+          <w:rFonts w:ascii="Consolas" w:hAnsi="Consolas"/>
+        </w:rPr>
+        <w:t>&gt;] [&lt;label</w:t>
+      </w:r>
+      <w:proofErr w:type="gramStart"/>
+      <w:r>
+        <w:rPr>
+          <w:rFonts w:ascii="Consolas" w:hAnsi="Consolas"/>
+        </w:rPr>
+        <w:t>&gt; :</w:t>
+      </w:r>
+      <w:proofErr w:type="gramEnd"/>
+      <w:r>
+        <w:rPr>
+          <w:rFonts w:ascii="Consolas" w:hAnsi="Consolas"/>
+        </w:rPr>
+        <w:t xml:space="preserve"> &lt;</w:t>
+      </w:r>
+      <w:proofErr w:type="spellStart"/>
+      <w:r>
+        <w:rPr>
+          <w:rFonts w:ascii="Consolas" w:hAnsi="Consolas"/>
+        </w:rPr>
+        <w:t>sp</w:t>
+      </w:r>
+      <w:proofErr w:type="spellEnd"/>
+      <w:r>
+        <w:rPr>
+          <w:rFonts w:ascii="Consolas" w:hAnsi="Consolas"/>
+        </w:rPr>
+        <w:t>&gt;]</w:t>
+      </w:r>
+    </w:p>
+    <w:p>
+      <w:pPr>
+        <w:rPr>
+          <w:rFonts w:ascii="Consolas" w:hAnsi="Consolas"/>
+        </w:rPr>
+      </w:pPr>
+      <w:r>
+        <w:rPr>
+          <w:rFonts w:ascii="Consolas" w:hAnsi="Consolas"/>
+        </w:rPr>
+        <w:t xml:space="preserve">         [&lt;op&gt; &lt;</w:t>
+      </w:r>
+      <w:proofErr w:type="spellStart"/>
+      <w:r>
+        <w:rPr>
+          <w:rFonts w:ascii="Consolas" w:hAnsi="Consolas"/>
+        </w:rPr>
+        <w:t>sp</w:t>
+      </w:r>
+      <w:proofErr w:type="spellEnd"/>
+      <w:r>
+        <w:rPr>
+          <w:rFonts w:ascii="Consolas" w:hAnsi="Consolas"/>
+        </w:rPr>
+        <w:t>&gt; &lt;operand</w:t>
+      </w:r>
+      <w:proofErr w:type="gramStart"/>
+      <w:r>
+        <w:rPr>
+          <w:rFonts w:ascii="Consolas" w:hAnsi="Consolas"/>
+        </w:rPr>
+        <w:t>&gt;[</w:t>
+      </w:r>
+      <w:proofErr w:type="gramEnd"/>
+      <w:r>
+        <w:rPr>
+          <w:rFonts w:ascii="Consolas" w:hAnsi="Consolas"/>
+        </w:rPr>
+        <w:t>, ..., &lt;operand&gt;] [&lt;</w:t>
+      </w:r>
+      <w:proofErr w:type="spellStart"/>
+      <w:r>
+        <w:rPr>
+          <w:rFonts w:ascii="Consolas" w:hAnsi="Consolas"/>
+        </w:rPr>
+        <w:t>sp</w:t>
+      </w:r>
+      <w:proofErr w:type="spellEnd"/>
+      <w:r>
+        <w:rPr>
+          <w:rFonts w:ascii="Consolas" w:hAnsi="Consolas"/>
+        </w:rPr>
+        <w:t>&gt;]] [&lt;comment&gt;] [&lt;auto-comment&gt;]</w:t>
+      </w:r>
+    </w:p>
+    <w:p>
+      <w:pPr>
+        <w:rPr>
+          <w:rFonts w:ascii="Consolas" w:hAnsi="Consolas"/>
+        </w:rPr>
+      </w:pPr>
+    </w:p>
+    <w:p>
+      <w:pPr>
+        <w:rPr>
+          <w:rFonts w:ascii="Consolas" w:hAnsi="Consolas"/>
+        </w:rPr>
+      </w:pPr>
+      <w:r>
+        <w:rPr>
+          <w:rFonts w:ascii="Consolas" w:hAnsi="Consolas"/>
+        </w:rPr>
+        <w:t>More formal version, with optionality omitted</w:t>
+      </w:r>
+      <w:r>
+        <w:rPr>
+          <w:rFonts w:ascii="Consolas" w:hAnsi="Consolas"/>
+        </w:rPr>
+        <w:t>. Since so much is optional, we’ll assume that’s handled in what follows, to simplify the presentation.</w:t>
+      </w:r>
+    </w:p>
+    <w:p>
+      <w:pPr>
+        <w:rPr>
+          <w:rFonts w:ascii="Consolas" w:hAnsi="Consolas"/>
+        </w:rPr>
+      </w:pPr>
+    </w:p>
+    <w:p>
+      <w:pPr>
+        <w:rPr>
+          <w:rFonts w:ascii="Consolas" w:hAnsi="Consolas" w:cs="Courier New"/>
+        </w:rPr>
+      </w:pPr>
+      <w:r>
+        <w:rPr>
+          <w:rFonts w:ascii="Consolas" w:hAnsi="Consolas" w:cs="Courier New"/>
+        </w:rPr>
+        <w:t>&lt;line&gt; = &lt;prefix-</w:t>
+      </w:r>
+      <w:proofErr w:type="spellStart"/>
+      <w:r>
+        <w:rPr>
+          <w:rFonts w:ascii="Consolas" w:hAnsi="Consolas" w:cs="Courier New"/>
+        </w:rPr>
+        <w:t>addr</w:t>
+      </w:r>
+      <w:proofErr w:type="spellEnd"/>
+      <w:r>
+        <w:rPr>
+          <w:rFonts w:ascii="Consolas" w:hAnsi="Consolas" w:cs="Courier New"/>
+        </w:rPr>
+        <w:t>&gt; &lt;</w:t>
+      </w:r>
+      <w:proofErr w:type="spellStart"/>
+      <w:r>
+        <w:rPr>
+          <w:rFonts w:ascii="Consolas" w:hAnsi="Consolas" w:cs="Courier New"/>
+        </w:rPr>
+        <w:t>sep</w:t>
+      </w:r>
+      <w:proofErr w:type="spellEnd"/>
+      <w:r>
+        <w:rPr>
+          <w:rFonts w:ascii="Consolas" w:hAnsi="Consolas" w:cs="Courier New"/>
+        </w:rPr>
+        <w:t>&gt; &lt;label&gt; &lt;</w:t>
+      </w:r>
+      <w:proofErr w:type="spellStart"/>
+      <w:r>
+        <w:rPr>
+          <w:rFonts w:ascii="Consolas" w:hAnsi="Consolas" w:cs="Courier New"/>
+        </w:rPr>
+        <w:t>sep</w:t>
+      </w:r>
+      <w:proofErr w:type="spellEnd"/>
+      <w:r>
+        <w:rPr>
+          <w:rFonts w:ascii="Consolas" w:hAnsi="Consolas" w:cs="Courier New"/>
+        </w:rPr>
+        <w:t>&gt; &lt;instruction&gt; &lt;</w:t>
+      </w:r>
+      <w:proofErr w:type="spellStart"/>
+      <w:r>
+        <w:rPr>
+          <w:rFonts w:ascii="Consolas" w:hAnsi="Consolas" w:cs="Courier New"/>
+        </w:rPr>
+        <w:t>sep</w:t>
+      </w:r>
+      <w:proofErr w:type="spellEnd"/>
+      <w:r>
+        <w:rPr>
+          <w:rFonts w:ascii="Consolas" w:hAnsi="Consolas" w:cs="Courier New"/>
+        </w:rPr>
+        <w:t xml:space="preserve">&gt; &lt;comment&gt; </w:t>
+      </w:r>
+    </w:p>
+    <w:p>
+      <w:pPr>
+        <w:rPr>
+          <w:rFonts w:ascii="Consolas" w:hAnsi="Consolas" w:cs="Courier New"/>
+        </w:rPr>
+      </w:pPr>
+      <w:r>
+        <w:rPr>
+          <w:rFonts w:ascii="Consolas" w:hAnsi="Consolas" w:cs="Courier New"/>
+        </w:rPr>
+        <w:t xml:space="preserve">                                                            </w:t>
+      </w:r>
+      <w:r>
+        <w:rPr>
+          <w:rFonts w:ascii="Consolas" w:hAnsi="Consolas" w:cs="Courier New"/>
+        </w:rPr>
+        <w:t>&lt;</w:t>
+      </w:r>
+      <w:proofErr w:type="spellStart"/>
+      <w:r>
+        <w:rPr>
+          <w:rFonts w:ascii="Consolas" w:hAnsi="Consolas" w:cs="Courier New"/>
+        </w:rPr>
+        <w:t>sep</w:t>
+      </w:r>
+      <w:proofErr w:type="spellEnd"/>
+      <w:r>
+        <w:rPr>
+          <w:rFonts w:ascii="Consolas" w:hAnsi="Consolas" w:cs="Courier New"/>
+        </w:rPr>
+        <w:t>&gt;</w:t>
+      </w:r>
+      <w:r>
+        <w:rPr>
+          <w:rFonts w:ascii="Consolas" w:hAnsi="Consolas" w:cs="Courier New"/>
+        </w:rPr>
+        <w:t xml:space="preserve"> </w:t>
+      </w:r>
+      <w:r>
+        <w:rPr>
+          <w:rFonts w:ascii="Consolas" w:hAnsi="Consolas" w:cs="Courier New"/>
+        </w:rPr>
+        <w:t>&lt;auto-comment&gt;</w:t>
+      </w:r>
+    </w:p>
+    <w:p>
+      <w:pPr>
+        <w:rPr>
+          <w:rFonts w:ascii="Consolas" w:hAnsi="Consolas" w:cs="Courier New"/>
+        </w:rPr>
+      </w:pPr>
+      <w:r>
+        <w:rPr>
+          <w:rFonts w:ascii="Consolas" w:hAnsi="Consolas" w:cs="Courier New"/>
+        </w:rPr>
+        <w:t>Clauses for the components:</w:t>
+      </w:r>
+    </w:p>
+    <w:p>
+      <w:pPr>
+        <w:rPr>
+          <w:rFonts w:ascii="Consolas" w:hAnsi="Consolas" w:cs="Courier New"/>
+        </w:rPr>
+      </w:pPr>
+      <w:r>
+        <w:rPr>
+          <w:rFonts w:ascii="Consolas" w:hAnsi="Consolas" w:cs="Courier New"/>
+        </w:rPr>
+        <w:t>&lt;prefix-</w:t>
+      </w:r>
+      <w:proofErr w:type="spellStart"/>
+      <w:r>
+        <w:rPr>
+          <w:rFonts w:ascii="Consolas" w:hAnsi="Consolas" w:cs="Courier New"/>
+        </w:rPr>
+        <w:t>addr</w:t>
+      </w:r>
+      <w:proofErr w:type="spellEnd"/>
+      <w:r>
+        <w:rPr>
+          <w:rFonts w:ascii="Consolas" w:hAnsi="Consolas" w:cs="Courier New"/>
+        </w:rPr>
+        <w:t>&gt; = &lt;oct</w:t>
+      </w:r>
+      <w:proofErr w:type="gramStart"/>
+      <w:r>
+        <w:rPr>
+          <w:rFonts w:ascii="Consolas" w:hAnsi="Consolas" w:cs="Courier New"/>
+        </w:rPr>
+        <w:t>&gt; .</w:t>
+      </w:r>
+      <w:proofErr w:type="gramEnd"/>
+      <w:r>
+        <w:rPr>
+          <w:rFonts w:ascii="Consolas" w:hAnsi="Consolas" w:cs="Courier New"/>
+        </w:rPr>
+        <w:t xml:space="preserve"> &lt;dec</w:t>
+      </w:r>
+      <w:proofErr w:type="gramStart"/>
+      <w:r>
+        <w:rPr>
+          <w:rFonts w:ascii="Consolas" w:hAnsi="Consolas" w:cs="Courier New"/>
+        </w:rPr>
+        <w:t>&gt; :</w:t>
+      </w:r>
+      <w:proofErr w:type="gramEnd"/>
+      <w:r>
+        <w:rPr>
+          <w:rFonts w:ascii="Consolas" w:hAnsi="Consolas" w:cs="Courier New"/>
+        </w:rPr>
+        <w:t xml:space="preserve"> &lt;oct&gt;</w:t>
+      </w:r>
+    </w:p>
+    <w:p>
+      <w:pPr>
+        <w:rPr>
+          <w:rFonts w:ascii="Consolas" w:hAnsi="Consolas" w:cs="Courier New"/>
+        </w:rPr>
+      </w:pPr>
+      <w:r>
+        <w:rPr>
+          <w:rFonts w:ascii="Consolas" w:hAnsi="Consolas" w:cs="Courier New"/>
+        </w:rPr>
         <w:lastRenderedPageBreak/>
-        <w:t xml:space="preserve">@S0300: </w:t>
-      </w:r>
-      <w:proofErr w:type="spellStart"/>
-      <w:r>
-        <w:rPr>
-          <w:rFonts w:ascii="Consolas" w:hAnsi="Consolas"/>
-        </w:rPr>
-        <w:t>do_dot</w:t>
-      </w:r>
-      <w:proofErr w:type="spellEnd"/>
-    </w:p>
-    <w:p>
-      <w:pPr>
-        <w:rPr>
-          <w:rFonts w:ascii="Consolas" w:hAnsi="Consolas"/>
-        </w:rPr>
-      </w:pPr>
-      <w:r>
-        <w:rPr>
-          <w:rFonts w:ascii="Consolas" w:hAnsi="Consolas"/>
-        </w:rPr>
-        <w:t>@S0500: u0500</w:t>
-      </w:r>
-    </w:p>
-    <w:p>
-      <w:pPr>
-        <w:rPr>
-          <w:rFonts w:ascii="Consolas" w:hAnsi="Consolas"/>
-        </w:rPr>
-      </w:pPr>
-      <w:r>
-        <w:rPr>
-          <w:rFonts w:ascii="Consolas" w:hAnsi="Consolas"/>
-        </w:rPr>
-        <w:t xml:space="preserve">@S0501: </w:t>
-      </w:r>
-      <w:proofErr w:type="spellStart"/>
-      <w:r>
-        <w:rPr>
-          <w:rFonts w:ascii="Consolas" w:hAnsi="Consolas"/>
-        </w:rPr>
-        <w:t>chr_cnt</w:t>
-      </w:r>
-      <w:proofErr w:type="spellEnd"/>
-    </w:p>
-    <w:p>
-      <w:pPr>
-        <w:rPr>
-          <w:rFonts w:ascii="Consolas" w:hAnsi="Consolas"/>
-        </w:rPr>
-      </w:pPr>
-    </w:p>
-    <w:p>
-      <w:pPr>
-        <w:rPr>
-          <w:rFonts w:ascii="Consolas" w:hAnsi="Consolas"/>
-        </w:rPr>
-      </w:pPr>
-      <w:r>
-        <w:rPr>
-          <w:rFonts w:ascii="Consolas" w:hAnsi="Consolas"/>
-        </w:rPr>
-        <w:t>@N0040: load constant 0o12 into AC</w:t>
-      </w:r>
-    </w:p>
-    <w:p>
-      <w:pPr>
-        <w:rPr>
-          <w:rFonts w:ascii="Consolas" w:hAnsi="Consolas"/>
-        </w:rPr>
-      </w:pPr>
-      <w:r>
-        <w:rPr>
-          <w:rFonts w:ascii="Consolas" w:hAnsi="Consolas"/>
-        </w:rPr>
-        <w:t xml:space="preserve">@N0041: Store it in </w:t>
+        <w:t>&lt;label&gt;       = &lt;identifier</w:t>
       </w:r>
       <w:proofErr w:type="gramStart"/>
       <w:r>
         <w:rPr>
-          <w:rFonts w:ascii="Consolas" w:hAnsi="Consolas"/>
-        </w:rPr>
-        <w:t>a</w:t>
+          <w:rFonts w:ascii="Consolas" w:hAnsi="Consolas" w:cs="Courier New"/>
+        </w:rPr>
+        <w:t>&gt; :</w:t>
       </w:r>
       <w:proofErr w:type="gramEnd"/>
-      <w:r>
-        <w:rPr>
-          <w:rFonts w:ascii="Consolas" w:hAnsi="Consolas"/>
-        </w:rPr>
-        <w:t xml:space="preserve"> FF Reg(??)</w:t>
-      </w:r>
-    </w:p>
-    <w:p>
-      <w:pPr>
-        <w:rPr>
-          <w:rFonts w:ascii="Consolas" w:hAnsi="Consolas"/>
-        </w:rPr>
-      </w:pPr>
-      <w:r>
-        <w:rPr>
-          <w:rFonts w:ascii="Consolas" w:hAnsi="Consolas"/>
-        </w:rPr>
-        <w:t>@N0042: load constant 0o140510 into AC</w:t>
-      </w:r>
-    </w:p>
-    <w:p>
-      <w:pPr>
-        <w:rPr>
-          <w:rFonts w:ascii="Consolas" w:hAnsi="Consolas"/>
-        </w:rPr>
-      </w:pPr>
-    </w:p>
-    <w:p>
-      <w:pPr>
-        <w:rPr>
-          <w:rFonts w:ascii="Consolas" w:hAnsi="Consolas"/>
-        </w:rPr>
-      </w:pPr>
-      <w:r>
-        <w:rPr>
-          <w:rFonts w:ascii="Consolas" w:hAnsi="Consolas"/>
-        </w:rPr>
-        <w:t>@E0042: print: "execute .print" ["1", "2"]</w:t>
-      </w:r>
-    </w:p>
-    <w:p>
-      <w:pPr>
-        <w:rPr>
-          <w:rFonts w:ascii="Consolas" w:hAnsi="Consolas"/>
-        </w:rPr>
-      </w:pPr>
-      <w:r>
-        <w:rPr>
-          <w:rFonts w:ascii="Consolas" w:hAnsi="Consolas"/>
-        </w:rPr>
-        <w:t xml:space="preserve">@E0043: exec: if True: </w:t>
+    </w:p>
+    <w:p>
+      <w:pPr>
+        <w:rPr>
+          <w:rFonts w:ascii="Consolas" w:hAnsi="Consolas" w:cs="Courier New"/>
+        </w:rPr>
+      </w:pPr>
+      <w:r>
+        <w:rPr>
+          <w:rFonts w:ascii="Consolas" w:hAnsi="Consolas" w:cs="Courier New"/>
+        </w:rPr>
+        <w:t>&lt;instruction&gt; = &lt;op&gt; &lt;whitespace&gt;+ &lt;expr&gt;</w:t>
+      </w:r>
+    </w:p>
+    <w:p>
+      <w:pPr>
+        <w:rPr>
+          <w:rFonts w:ascii="Consolas" w:hAnsi="Consolas" w:cs="Courier New"/>
+        </w:rPr>
+      </w:pPr>
+      <w:r>
+        <w:rPr>
+          <w:rFonts w:ascii="Consolas" w:hAnsi="Consolas" w:cs="Courier New"/>
+        </w:rPr>
+        <w:t>&lt;op&gt;          = &lt;ww-op&gt;|&lt;pseudo-op&gt;</w:t>
+      </w:r>
+    </w:p>
+    <w:p>
+      <w:pPr>
+        <w:rPr>
+          <w:rFonts w:ascii="Consolas" w:hAnsi="Consolas" w:cs="Courier New"/>
+        </w:rPr>
+      </w:pPr>
+      <w:r>
+        <w:rPr>
+          <w:rFonts w:ascii="Consolas" w:hAnsi="Consolas" w:cs="Courier New"/>
+        </w:rPr>
+        <w:t xml:space="preserve">&lt;ww-op&gt;       = </w:t>
+      </w:r>
+      <w:proofErr w:type="spellStart"/>
+      <w:r>
+        <w:rPr>
+          <w:rFonts w:ascii="Consolas" w:hAnsi="Consolas" w:cs="Courier New"/>
+        </w:rPr>
+        <w:t>ta|ao</w:t>
+      </w:r>
+      <w:proofErr w:type="spellEnd"/>
+      <w:r>
+        <w:rPr>
+          <w:rFonts w:ascii="Consolas" w:hAnsi="Consolas" w:cs="Courier New"/>
+        </w:rPr>
+        <w:t>|...</w:t>
+      </w:r>
+    </w:p>
+    <w:p>
+      <w:pPr>
+        <w:rPr>
+          <w:rFonts w:ascii="Consolas" w:hAnsi="Consolas" w:cs="Courier New"/>
+        </w:rPr>
+      </w:pPr>
+      <w:r>
+        <w:rPr>
+          <w:rFonts w:ascii="Consolas" w:hAnsi="Consolas" w:cs="Courier New"/>
+        </w:rPr>
+        <w:t xml:space="preserve">&lt;pseudo-op&gt;   </w:t>
       </w:r>
       <w:proofErr w:type="gramStart"/>
       <w:r>
         <w:rPr>
-          <w:rFonts w:ascii="Consolas" w:hAnsi="Consolas"/>
-        </w:rPr>
-        <w:t>print(</w:t>
+          <w:rFonts w:ascii="Consolas" w:hAnsi="Consolas" w:cs="Courier New"/>
+        </w:rPr>
+        <w:t>= .</w:t>
       </w:r>
       <w:proofErr w:type="gramEnd"/>
       <w:r>
         <w:rPr>
-          <w:rFonts w:ascii="Consolas" w:hAnsi="Consolas"/>
-        </w:rPr>
-        <w:t>"</w:t>
-      </w:r>
-      <w:proofErr w:type="gramStart"/>
-      <w:r>
-        <w:rPr>
-          <w:rFonts w:ascii="Consolas" w:hAnsi="Consolas"/>
-        </w:rPr>
-        <w:t>executed .exec</w:t>
-      </w:r>
-      <w:proofErr w:type="gramEnd"/>
-      <w:r>
-        <w:rPr>
-          <w:rFonts w:ascii="Consolas" w:hAnsi="Consolas"/>
-        </w:rPr>
-        <w:t>")</w:t>
-      </w:r>
-    </w:p>
-    <w:p>
-      <w:pPr>
-        <w:rPr>
-          <w:rFonts w:ascii="Consolas" w:hAnsi="Consolas"/>
-        </w:rPr>
-      </w:pPr>
-    </w:p>
-    <w:p>
-      <w:pPr>
-        <w:pStyle w:val="Heading2"/>
-      </w:pPr>
-      <w:bookmarkStart w:id="29" w:name="_Toc187018292"/>
-      <w:r>
-        <w:t>Assembler Grammar</w:t>
-      </w:r>
-      <w:bookmarkEnd w:id="29"/>
-    </w:p>
-    <w:p>
-      <w:pPr>
-        <w:rPr>
-          <w:rFonts w:ascii="Consolas" w:hAnsi="Consolas"/>
-        </w:rPr>
-      </w:pPr>
-      <w:r>
-        <w:rPr>
-          <w:rFonts w:ascii="Consolas" w:hAnsi="Consolas"/>
-        </w:rPr>
-        <w:t xml:space="preserve">The tokenizer and parser in wwasmparser.py follow this grammar fairly well, but there are probably a few spots where it doesn't line up. The code version wins unless it's shown to be some kind of error. Something not captured well </w:t>
-      </w:r>
-      <w:r>
-        <w:rPr>
-          <w:rFonts w:ascii="Consolas" w:hAnsi="Consolas"/>
-        </w:rPr>
-        <w:t xml:space="preserve">in this grammar </w:t>
-      </w:r>
-      <w:r>
-        <w:rPr>
-          <w:rFonts w:ascii="Consolas" w:hAnsi="Consolas"/>
-        </w:rPr>
-        <w:t xml:space="preserve">is some special casing needed </w:t>
-      </w:r>
-      <w:proofErr w:type="gramStart"/>
-      <w:r>
-        <w:rPr>
-          <w:rFonts w:ascii="Consolas" w:hAnsi="Consolas"/>
-        </w:rPr>
-        <w:t>for .</w:t>
-      </w:r>
-      <w:proofErr w:type="gramEnd"/>
-      <w:r>
-        <w:rPr>
-          <w:rFonts w:ascii="Consolas" w:hAnsi="Consolas"/>
-        </w:rPr>
-        <w:t>exec.</w:t>
-      </w:r>
-    </w:p>
-    <w:p>
-      <w:pPr>
-        <w:rPr>
-          <w:rFonts w:ascii="Consolas" w:hAnsi="Consolas"/>
-        </w:rPr>
-      </w:pPr>
-      <w:r>
-        <w:rPr>
-          <w:rFonts w:ascii="Consolas" w:hAnsi="Consolas"/>
-        </w:rPr>
-        <w:t xml:space="preserve">Note that the grammar tries to capture the nuances of number denotation, but in the </w:t>
-      </w:r>
-      <w:proofErr w:type="gramStart"/>
-      <w:r>
-        <w:rPr>
-          <w:rFonts w:ascii="Consolas" w:hAnsi="Consolas"/>
-        </w:rPr>
-        <w:t>code</w:t>
-      </w:r>
-      <w:proofErr w:type="gramEnd"/>
-      <w:r>
-        <w:rPr>
-          <w:rFonts w:ascii="Consolas" w:hAnsi="Consolas"/>
-        </w:rPr>
-        <w:t xml:space="preserve"> we use dot (".") as an operator and distinguish the number types in eval. This frees us from having to add lexical knowledge of those number forms.</w:t>
-      </w:r>
-    </w:p>
-    <w:p>
-      <w:pPr>
-        <w:rPr>
-          <w:rFonts w:ascii="Consolas" w:hAnsi="Consolas"/>
-        </w:rPr>
-      </w:pPr>
-      <w:r>
-        <w:rPr>
-          <w:rFonts w:ascii="Consolas" w:hAnsi="Consolas"/>
-        </w:rPr>
-        <w:t xml:space="preserve">Informal grammar of </w:t>
-      </w:r>
-      <w:r>
-        <w:rPr>
-          <w:rFonts w:ascii="Consolas" w:hAnsi="Consolas"/>
-        </w:rPr>
-        <w:t xml:space="preserve">a </w:t>
-      </w:r>
-      <w:r>
-        <w:rPr>
-          <w:rFonts w:ascii="Consolas" w:hAnsi="Consolas"/>
-        </w:rPr>
-        <w:t>single line, showing what's optional:</w:t>
-      </w:r>
-    </w:p>
-    <w:p>
-      <w:pPr>
-        <w:rPr>
-          <w:rFonts w:ascii="Consolas" w:hAnsi="Consolas"/>
-        </w:rPr>
-      </w:pPr>
-    </w:p>
-    <w:p>
-      <w:pPr>
-        <w:rPr>
-          <w:rFonts w:ascii="Consolas" w:hAnsi="Consolas"/>
-        </w:rPr>
-      </w:pPr>
-      <w:r>
-        <w:rPr>
-          <w:rFonts w:ascii="Consolas" w:hAnsi="Consolas"/>
-        </w:rPr>
-        <w:t>&lt;line&gt; = [@ &lt;oct&gt; [. &lt;dec&gt;</w:t>
-      </w:r>
-      <w:proofErr w:type="gramStart"/>
-      <w:r>
-        <w:rPr>
-          <w:rFonts w:ascii="Consolas" w:hAnsi="Consolas"/>
-        </w:rPr>
-        <w:t>] :</w:t>
-      </w:r>
-      <w:proofErr w:type="gramEnd"/>
-      <w:r>
-        <w:rPr>
-          <w:rFonts w:ascii="Consolas" w:hAnsi="Consolas"/>
-        </w:rPr>
-        <w:t xml:space="preserve"> &lt;oct&gt; &lt;</w:t>
-      </w:r>
-      <w:proofErr w:type="spellStart"/>
-      <w:r>
-        <w:rPr>
-          <w:rFonts w:ascii="Consolas" w:hAnsi="Consolas"/>
-        </w:rPr>
-        <w:t>sp</w:t>
-      </w:r>
-      <w:proofErr w:type="spellEnd"/>
-      <w:r>
-        <w:rPr>
-          <w:rFonts w:ascii="Consolas" w:hAnsi="Consolas"/>
-        </w:rPr>
-        <w:t>&gt;] [&lt;label</w:t>
-      </w:r>
-      <w:proofErr w:type="gramStart"/>
-      <w:r>
-        <w:rPr>
-          <w:rFonts w:ascii="Consolas" w:hAnsi="Consolas"/>
-        </w:rPr>
-        <w:t>&gt; :</w:t>
-      </w:r>
-      <w:proofErr w:type="gramEnd"/>
-      <w:r>
-        <w:rPr>
-          <w:rFonts w:ascii="Consolas" w:hAnsi="Consolas"/>
-        </w:rPr>
-        <w:t xml:space="preserve"> &lt;</w:t>
-      </w:r>
-      <w:proofErr w:type="spellStart"/>
-      <w:r>
-        <w:rPr>
-          <w:rFonts w:ascii="Consolas" w:hAnsi="Consolas"/>
-        </w:rPr>
-        <w:t>sp</w:t>
-      </w:r>
-      <w:proofErr w:type="spellEnd"/>
-      <w:r>
-        <w:rPr>
-          <w:rFonts w:ascii="Consolas" w:hAnsi="Consolas"/>
-        </w:rPr>
-        <w:t>&gt;]</w:t>
-      </w:r>
-    </w:p>
-    <w:p>
-      <w:pPr>
-        <w:rPr>
-          <w:rFonts w:ascii="Consolas" w:hAnsi="Consolas"/>
-        </w:rPr>
-      </w:pPr>
-      <w:r>
-        <w:rPr>
-          <w:rFonts w:ascii="Consolas" w:hAnsi="Consolas"/>
-        </w:rPr>
-        <w:t xml:space="preserve">         [&lt;op&gt; &lt;</w:t>
-      </w:r>
-      <w:proofErr w:type="spellStart"/>
-      <w:r>
-        <w:rPr>
-          <w:rFonts w:ascii="Consolas" w:hAnsi="Consolas"/>
-        </w:rPr>
-        <w:t>sp</w:t>
-      </w:r>
-      <w:proofErr w:type="spellEnd"/>
-      <w:r>
-        <w:rPr>
-          <w:rFonts w:ascii="Consolas" w:hAnsi="Consolas"/>
-        </w:rPr>
-        <w:t>&gt; &lt;operand</w:t>
-      </w:r>
-      <w:proofErr w:type="gramStart"/>
-      <w:r>
-        <w:rPr>
-          <w:rFonts w:ascii="Consolas" w:hAnsi="Consolas"/>
-        </w:rPr>
-        <w:t>&gt;[</w:t>
-      </w:r>
-      <w:proofErr w:type="gramEnd"/>
-      <w:r>
-        <w:rPr>
-          <w:rFonts w:ascii="Consolas" w:hAnsi="Consolas"/>
-        </w:rPr>
-        <w:t>, ..., &lt;operand&gt;] [&lt;</w:t>
-      </w:r>
-      <w:proofErr w:type="spellStart"/>
-      <w:r>
-        <w:rPr>
-          <w:rFonts w:ascii="Consolas" w:hAnsi="Consolas"/>
-        </w:rPr>
-        <w:t>sp</w:t>
-      </w:r>
-      <w:proofErr w:type="spellEnd"/>
-      <w:r>
-        <w:rPr>
-          <w:rFonts w:ascii="Consolas" w:hAnsi="Consolas"/>
-        </w:rPr>
-        <w:t>&gt;]] [&lt;comment&gt;] [&lt;auto-comment&gt;]</w:t>
-      </w:r>
-    </w:p>
-    <w:p>
-      <w:pPr>
-        <w:rPr>
-          <w:rFonts w:ascii="Consolas" w:hAnsi="Consolas"/>
-        </w:rPr>
-      </w:pPr>
-    </w:p>
-    <w:p>
-      <w:pPr>
-        <w:rPr>
-          <w:rFonts w:ascii="Consolas" w:hAnsi="Consolas"/>
-        </w:rPr>
-      </w:pPr>
-      <w:r>
-        <w:rPr>
-          <w:rFonts w:ascii="Consolas" w:hAnsi="Consolas"/>
-        </w:rPr>
-        <w:t>More formal version, with optionality omitted</w:t>
-      </w:r>
-      <w:r>
-        <w:rPr>
-          <w:rFonts w:ascii="Consolas" w:hAnsi="Consolas"/>
-        </w:rPr>
-        <w:t>. Since so much is optional, we’ll assume that’s handled in what follows, to simplify the presentation.</w:t>
-      </w:r>
-    </w:p>
-    <w:p>
-      <w:pPr>
-        <w:rPr>
-          <w:rFonts w:ascii="Consolas" w:hAnsi="Consolas"/>
-        </w:rPr>
-      </w:pPr>
-    </w:p>
-    <w:p>
-      <w:pPr>
-        <w:rPr>
-          <w:rFonts w:ascii="Consolas" w:hAnsi="Consolas" w:cs="Courier New"/>
-        </w:rPr>
-      </w:pPr>
-      <w:r>
-        <w:rPr>
-          <w:rFonts w:ascii="Consolas" w:hAnsi="Consolas" w:cs="Courier New"/>
-        </w:rPr>
-        <w:t>&lt;line&gt; = &lt;prefix-</w:t>
-      </w:r>
-      <w:proofErr w:type="spellStart"/>
-      <w:r>
-        <w:rPr>
-          <w:rFonts w:ascii="Consolas" w:hAnsi="Consolas" w:cs="Courier New"/>
-        </w:rPr>
-        <w:t>addr</w:t>
-      </w:r>
-      <w:proofErr w:type="spellEnd"/>
-      <w:r>
-        <w:rPr>
-          <w:rFonts w:ascii="Consolas" w:hAnsi="Consolas" w:cs="Courier New"/>
-        </w:rPr>
-        <w:t>&gt; &lt;</w:t>
-      </w:r>
-      <w:proofErr w:type="spellStart"/>
-      <w:r>
-        <w:rPr>
-          <w:rFonts w:ascii="Consolas" w:hAnsi="Consolas" w:cs="Courier New"/>
-        </w:rPr>
-        <w:t>sep</w:t>
-      </w:r>
-      <w:proofErr w:type="spellEnd"/>
-      <w:r>
-        <w:rPr>
-          <w:rFonts w:ascii="Consolas" w:hAnsi="Consolas" w:cs="Courier New"/>
-        </w:rPr>
-        <w:t>&gt; &lt;label&gt; &lt;</w:t>
-      </w:r>
-      <w:proofErr w:type="spellStart"/>
-      <w:r>
-        <w:rPr>
-          <w:rFonts w:ascii="Consolas" w:hAnsi="Consolas" w:cs="Courier New"/>
-        </w:rPr>
-        <w:t>sep</w:t>
-      </w:r>
-      <w:proofErr w:type="spellEnd"/>
-      <w:r>
-        <w:rPr>
-          <w:rFonts w:ascii="Consolas" w:hAnsi="Consolas" w:cs="Courier New"/>
-        </w:rPr>
-        <w:t>&gt; &lt;instruction&gt; &lt;</w:t>
-      </w:r>
-      <w:proofErr w:type="spellStart"/>
-      <w:r>
-        <w:rPr>
-          <w:rFonts w:ascii="Consolas" w:hAnsi="Consolas" w:cs="Courier New"/>
-        </w:rPr>
-        <w:t>sep</w:t>
-      </w:r>
-      <w:proofErr w:type="spellEnd"/>
-      <w:r>
-        <w:rPr>
-          <w:rFonts w:ascii="Consolas" w:hAnsi="Consolas" w:cs="Courier New"/>
-        </w:rPr>
-        <w:t xml:space="preserve">&gt; &lt;comment&gt; </w:t>
-      </w:r>
-    </w:p>
-    <w:p>
-      <w:pPr>
-        <w:rPr>
-          <w:rFonts w:ascii="Consolas" w:hAnsi="Consolas" w:cs="Courier New"/>
-        </w:rPr>
-      </w:pPr>
-      <w:r>
-        <w:rPr>
-          <w:rFonts w:ascii="Consolas" w:hAnsi="Consolas" w:cs="Courier New"/>
-        </w:rPr>
-        <w:t xml:space="preserve">                                                            </w:t>
-      </w:r>
-      <w:r>
-        <w:rPr>
-          <w:rFonts w:ascii="Consolas" w:hAnsi="Consolas" w:cs="Courier New"/>
-        </w:rPr>
-        <w:t>&lt;</w:t>
-      </w:r>
-      <w:proofErr w:type="spellStart"/>
-      <w:r>
-        <w:rPr>
-          <w:rFonts w:ascii="Consolas" w:hAnsi="Consolas" w:cs="Courier New"/>
-        </w:rPr>
-        <w:t>sep</w:t>
-      </w:r>
-      <w:proofErr w:type="spellEnd"/>
-      <w:r>
-        <w:rPr>
-          <w:rFonts w:ascii="Consolas" w:hAnsi="Consolas" w:cs="Courier New"/>
-        </w:rPr>
-        <w:t>&gt;</w:t>
-      </w:r>
-      <w:r>
-        <w:rPr>
-          <w:rFonts w:ascii="Consolas" w:hAnsi="Consolas" w:cs="Courier New"/>
-        </w:rPr>
-        <w:t xml:space="preserve"> </w:t>
-      </w:r>
-      <w:r>
-        <w:rPr>
-          <w:rFonts w:ascii="Consolas" w:hAnsi="Consolas" w:cs="Courier New"/>
-        </w:rPr>
-        <w:t>&lt;auto-comment&gt;</w:t>
-      </w:r>
-    </w:p>
-    <w:p>
-      <w:pPr>
-        <w:rPr>
-          <w:rFonts w:ascii="Consolas" w:hAnsi="Consolas" w:cs="Courier New"/>
-        </w:rPr>
-      </w:pPr>
-      <w:r>
-        <w:rPr>
-          <w:rFonts w:ascii="Consolas" w:hAnsi="Consolas" w:cs="Courier New"/>
-        </w:rPr>
-        <w:t>Clauses for the components:</w:t>
-      </w:r>
-    </w:p>
-    <w:p>
-      <w:pPr>
-        <w:rPr>
-          <w:rFonts w:ascii="Consolas" w:hAnsi="Consolas" w:cs="Courier New"/>
-        </w:rPr>
-      </w:pPr>
-      <w:r>
-        <w:rPr>
-          <w:rFonts w:ascii="Consolas" w:hAnsi="Consolas" w:cs="Courier New"/>
-        </w:rPr>
-        <w:t>&lt;prefix-</w:t>
-      </w:r>
-      <w:proofErr w:type="spellStart"/>
-      <w:r>
-        <w:rPr>
-          <w:rFonts w:ascii="Consolas" w:hAnsi="Consolas" w:cs="Courier New"/>
-        </w:rPr>
-        <w:t>addr</w:t>
-      </w:r>
-      <w:proofErr w:type="spellEnd"/>
-      <w:r>
-        <w:rPr>
-          <w:rFonts w:ascii="Consolas" w:hAnsi="Consolas" w:cs="Courier New"/>
-        </w:rPr>
-        <w:t>&gt; = &lt;oct</w:t>
-      </w:r>
-      <w:proofErr w:type="gramStart"/>
-      <w:r>
-        <w:rPr>
-          <w:rFonts w:ascii="Consolas" w:hAnsi="Consolas" w:cs="Courier New"/>
-        </w:rPr>
-        <w:t>&gt; .</w:t>
-      </w:r>
-      <w:proofErr w:type="gramEnd"/>
-      <w:r>
-        <w:rPr>
-          <w:rFonts w:ascii="Consolas" w:hAnsi="Consolas" w:cs="Courier New"/>
-        </w:rPr>
-        <w:t xml:space="preserve"> &lt;dec</w:t>
-      </w:r>
-      <w:proofErr w:type="gramStart"/>
-      <w:r>
-        <w:rPr>
-          <w:rFonts w:ascii="Consolas" w:hAnsi="Consolas" w:cs="Courier New"/>
-        </w:rPr>
-        <w:t>&gt; :</w:t>
-      </w:r>
-      <w:proofErr w:type="gramEnd"/>
-      <w:r>
-        <w:rPr>
-          <w:rFonts w:ascii="Consolas" w:hAnsi="Consolas" w:cs="Courier New"/>
-        </w:rPr>
-        <w:t xml:space="preserve"> &lt;oct&gt;</w:t>
-      </w:r>
-    </w:p>
-    <w:p>
-      <w:pPr>
-        <w:rPr>
-          <w:rFonts w:ascii="Consolas" w:hAnsi="Consolas" w:cs="Courier New"/>
-        </w:rPr>
-      </w:pPr>
-      <w:r>
-        <w:rPr>
-          <w:rFonts w:ascii="Consolas" w:hAnsi="Consolas" w:cs="Courier New"/>
-        </w:rPr>
-        <w:t>&lt;label&gt;       = &lt;identifier</w:t>
-      </w:r>
-      <w:proofErr w:type="gramStart"/>
-      <w:r>
-        <w:rPr>
-          <w:rFonts w:ascii="Consolas" w:hAnsi="Consolas" w:cs="Courier New"/>
-        </w:rPr>
-        <w:t>&gt; :</w:t>
-      </w:r>
-      <w:proofErr w:type="gramEnd"/>
-    </w:p>
-    <w:p>
-      <w:pPr>
-        <w:rPr>
-          <w:rFonts w:ascii="Consolas" w:hAnsi="Consolas" w:cs="Courier New"/>
-        </w:rPr>
-      </w:pPr>
-      <w:r>
-        <w:rPr>
-          <w:rFonts w:ascii="Consolas" w:hAnsi="Consolas" w:cs="Courier New"/>
-        </w:rPr>
-        <w:t>&lt;instruction&gt; = &lt;op&gt; &lt;whitespace&gt;+ &lt;expr&gt;</w:t>
-      </w:r>
-    </w:p>
-    <w:p>
-      <w:pPr>
-        <w:rPr>
-          <w:rFonts w:ascii="Consolas" w:hAnsi="Consolas" w:cs="Courier New"/>
-        </w:rPr>
-      </w:pPr>
-      <w:r>
-        <w:rPr>
-          <w:rFonts w:ascii="Consolas" w:hAnsi="Consolas" w:cs="Courier New"/>
-        </w:rPr>
-        <w:t>&lt;op&gt;          = &lt;ww-op&gt;|&lt;pseudo-op&gt;</w:t>
-      </w:r>
-    </w:p>
-    <w:p>
-      <w:pPr>
-        <w:rPr>
-          <w:rFonts w:ascii="Consolas" w:hAnsi="Consolas" w:cs="Courier New"/>
-        </w:rPr>
-      </w:pPr>
-      <w:r>
-        <w:rPr>
-          <w:rFonts w:ascii="Consolas" w:hAnsi="Consolas" w:cs="Courier New"/>
-        </w:rPr>
-        <w:t xml:space="preserve">&lt;ww-op&gt;       = </w:t>
-      </w:r>
-      <w:proofErr w:type="spellStart"/>
-      <w:r>
-        <w:rPr>
-          <w:rFonts w:ascii="Consolas" w:hAnsi="Consolas" w:cs="Courier New"/>
-        </w:rPr>
-        <w:t>ta|ao</w:t>
-      </w:r>
-      <w:proofErr w:type="spellEnd"/>
-      <w:r>
-        <w:rPr>
-          <w:rFonts w:ascii="Consolas" w:hAnsi="Consolas" w:cs="Courier New"/>
-        </w:rPr>
-        <w:t>|...</w:t>
-      </w:r>
-    </w:p>
-    <w:p>
-      <w:pPr>
-        <w:rPr>
-          <w:rFonts w:ascii="Consolas" w:hAnsi="Consolas" w:cs="Courier New"/>
-        </w:rPr>
-      </w:pPr>
-      <w:r>
-        <w:rPr>
-          <w:rFonts w:ascii="Consolas" w:hAnsi="Consolas" w:cs="Courier New"/>
-        </w:rPr>
-        <w:t xml:space="preserve">&lt;pseudo-op&gt;   </w:t>
-      </w:r>
-      <w:proofErr w:type="gramStart"/>
-      <w:r>
-        <w:rPr>
-          <w:rFonts w:ascii="Consolas" w:hAnsi="Consolas" w:cs="Courier New"/>
-        </w:rPr>
-        <w:t>= .</w:t>
-      </w:r>
-      <w:proofErr w:type="gramEnd"/>
-      <w:r>
-        <w:rPr>
           <w:rFonts w:ascii="Consolas" w:hAnsi="Consolas" w:cs="Courier New"/>
         </w:rPr>
         <w:t>word|.org|...</w:t>
@@ -17477,7 +18226,6 @@
         <w:rPr>
           <w:rFonts w:ascii="Consolas" w:hAnsi="Consolas" w:cs="Courier New"/>
         </w:rPr>
-        <w:lastRenderedPageBreak/>
         <w:t>&lt;operand&gt;     = &lt;comma-expr&gt;</w:t>
       </w:r>
     </w:p>
@@ -21760,7 +22508,7 @@
       <w:rPr>
         <w:noProof/>
       </w:rPr>
-      <w:t>April 4, 2026</w:t>
+      <w:t>April 13, 2026</w:t>
     </w:r>
     <w:r>
       <w:fldChar w:fldCharType="end"/>

</xml_diff>

<commit_message>
fixed a typo in the Help message for --LEDbrightness
</commit_message>
<xml_diff>
--- a/Documentation/Whirlwind-Development-Environment.docx
+++ b/Documentation/Whirlwind-Development-Environment.docx
@@ -21356,6 +21356,276 @@
     <w:p/>
     <w:p>
       <w:pPr>
+        <w:pStyle w:val="PlainText"/>
+        <w:rPr>
+          <w:rFonts w:ascii="Courier New" w:hAnsi="Courier New" w:cs="Courier New"/>
+          <w:sz w:val="16"/>
+          <w:szCs w:val="16"/>
+        </w:rPr>
+      </w:pPr>
+      <w:r>
+        <w:rPr>
+          <w:rFonts w:ascii="Courier New" w:hAnsi="Courier New" w:cs="Courier New"/>
+          <w:sz w:val="16"/>
+          <w:szCs w:val="16"/>
+        </w:rPr>
+        <w:t xml:space="preserve">  --</w:t>
+      </w:r>
+      <w:proofErr w:type="spellStart"/>
+      <w:r>
+        <w:rPr>
+          <w:rFonts w:ascii="Courier New" w:hAnsi="Courier New" w:cs="Courier New"/>
+          <w:sz w:val="16"/>
+          <w:szCs w:val="16"/>
+        </w:rPr>
+        <w:t>LEDbrightness</w:t>
+      </w:r>
+      <w:proofErr w:type="spellEnd"/>
+      <w:r>
+        <w:rPr>
+          <w:rFonts w:ascii="Courier New" w:hAnsi="Courier New" w:cs="Courier New"/>
+          <w:sz w:val="16"/>
+          <w:szCs w:val="16"/>
+        </w:rPr>
+        <w:t xml:space="preserve"> LEDBRIGHTNESS</w:t>
+      </w:r>
+    </w:p>
+    <w:p>
+      <w:pPr>
+        <w:pStyle w:val="PlainText"/>
+        <w:rPr>
+          <w:rFonts w:ascii="Courier New" w:hAnsi="Courier New" w:cs="Courier New"/>
+          <w:sz w:val="16"/>
+          <w:szCs w:val="16"/>
+        </w:rPr>
+      </w:pPr>
+      <w:r>
+        <w:rPr>
+          <w:rFonts w:ascii="Courier New" w:hAnsi="Courier New" w:cs="Courier New"/>
+          <w:sz w:val="16"/>
+          <w:szCs w:val="16"/>
+        </w:rPr>
+        <w:t xml:space="preserve">                        Configure </w:t>
+      </w:r>
+      <w:proofErr w:type="spellStart"/>
+      <w:r>
+        <w:rPr>
+          <w:rFonts w:ascii="Courier New" w:hAnsi="Courier New" w:cs="Courier New"/>
+          <w:sz w:val="16"/>
+          <w:szCs w:val="16"/>
+        </w:rPr>
+        <w:t>MicroWhirlwind</w:t>
+      </w:r>
+      <w:proofErr w:type="spellEnd"/>
+      <w:r>
+        <w:rPr>
+          <w:rFonts w:ascii="Courier New" w:hAnsi="Courier New" w:cs="Courier New"/>
+          <w:sz w:val="16"/>
+          <w:szCs w:val="16"/>
+        </w:rPr>
+        <w:t xml:space="preserve"> LED intensity as three </w:t>
+      </w:r>
+      <w:proofErr w:type="spellStart"/>
+      <w:r>
+        <w:rPr>
+          <w:rFonts w:ascii="Courier New" w:hAnsi="Courier New" w:cs="Courier New"/>
+          <w:sz w:val="16"/>
+          <w:szCs w:val="16"/>
+        </w:rPr>
+        <w:t>ints</w:t>
+      </w:r>
+      <w:proofErr w:type="spellEnd"/>
+      <w:r>
+        <w:rPr>
+          <w:rFonts w:ascii="Courier New" w:hAnsi="Courier New" w:cs="Courier New"/>
+          <w:sz w:val="16"/>
+          <w:szCs w:val="16"/>
+        </w:rPr>
+        <w:t xml:space="preserve">; </w:t>
+      </w:r>
+      <w:proofErr w:type="spellStart"/>
+      <w:r>
+        <w:rPr>
+          <w:rFonts w:ascii="Courier New" w:hAnsi="Courier New" w:cs="Courier New"/>
+          <w:sz w:val="16"/>
+          <w:szCs w:val="16"/>
+        </w:rPr>
+        <w:t>r,w,b</w:t>
+      </w:r>
+      <w:proofErr w:type="spellEnd"/>
+    </w:p>
+    <w:p>
+      <w:pPr>
+        <w:pStyle w:val="PlainText"/>
+        <w:rPr>
+          <w:rFonts w:ascii="Courier New" w:hAnsi="Courier New" w:cs="Courier New"/>
+          <w:sz w:val="16"/>
+          <w:szCs w:val="16"/>
+        </w:rPr>
+      </w:pPr>
+    </w:p>
+    <w:p>
+      <w:pPr>
+        <w:pStyle w:val="PlainText"/>
+        <w:rPr>
+          <w:rFonts w:ascii="Courier New" w:hAnsi="Courier New" w:cs="Courier New"/>
+          <w:sz w:val="16"/>
+          <w:szCs w:val="16"/>
+        </w:rPr>
+      </w:pPr>
+      <w:r>
+        <w:rPr>
+          <w:rFonts w:ascii="Arial" w:hAnsi="Arial" w:cs="Arial"/>
+          <w:sz w:val="20"/>
+          <w:szCs w:val="20"/>
+        </w:rPr>
+        <w:t xml:space="preserve">Using the </w:t>
+      </w:r>
+      <w:r>
+        <w:rPr>
+          <w:rFonts w:ascii="Arial" w:hAnsi="Arial" w:cs="Arial"/>
+          <w:sz w:val="20"/>
+          <w:szCs w:val="20"/>
+        </w:rPr>
+        <w:t>argument</w:t>
+      </w:r>
+      <w:r>
+        <w:rPr>
+          <w:rFonts w:ascii="Courier New" w:hAnsi="Courier New" w:cs="Courier New"/>
+          <w:sz w:val="16"/>
+          <w:szCs w:val="16"/>
+        </w:rPr>
+        <w:t xml:space="preserve"> --</w:t>
+      </w:r>
+      <w:proofErr w:type="spellStart"/>
+      <w:r>
+        <w:rPr>
+          <w:rFonts w:ascii="Courier New" w:hAnsi="Courier New" w:cs="Courier New"/>
+          <w:sz w:val="16"/>
+          <w:szCs w:val="16"/>
+        </w:rPr>
+        <w:t>LEDbrightness</w:t>
+      </w:r>
+      <w:proofErr w:type="spellEnd"/>
+      <w:r>
+        <w:rPr>
+          <w:rFonts w:ascii="Courier New" w:hAnsi="Courier New" w:cs="Courier New"/>
+          <w:sz w:val="16"/>
+          <w:szCs w:val="16"/>
+        </w:rPr>
+        <w:t xml:space="preserve"> </w:t>
+      </w:r>
+      <w:r>
+        <w:rPr>
+          <w:rFonts w:ascii="Courier New" w:hAnsi="Courier New" w:cs="Courier New"/>
+          <w:sz w:val="16"/>
+          <w:szCs w:val="16"/>
+        </w:rPr>
+        <w:t xml:space="preserve">0 </w:t>
+      </w:r>
+      <w:r>
+        <w:t xml:space="preserve"> prints the default LED brightness values</w:t>
+      </w:r>
+    </w:p>
+    <w:p/>
+    <w:p>
+      <w:pPr>
+        <w:pStyle w:val="PlainText"/>
+        <w:rPr>
+          <w:rFonts w:ascii="Courier New" w:hAnsi="Courier New" w:cs="Courier New"/>
+          <w:sz w:val="16"/>
+          <w:szCs w:val="16"/>
+        </w:rPr>
+      </w:pPr>
+      <w:r>
+        <w:rPr>
+          <w:rFonts w:ascii="Courier New" w:hAnsi="Courier New" w:cs="Courier New"/>
+          <w:sz w:val="16"/>
+          <w:szCs w:val="16"/>
+        </w:rPr>
+        <w:t xml:space="preserve">  --</w:t>
+      </w:r>
+      <w:proofErr w:type="spellStart"/>
+      <w:r>
+        <w:rPr>
+          <w:rFonts w:ascii="Courier New" w:hAnsi="Courier New" w:cs="Courier New"/>
+          <w:sz w:val="16"/>
+          <w:szCs w:val="16"/>
+        </w:rPr>
+        <w:t>CRTgeometry</w:t>
+      </w:r>
+      <w:proofErr w:type="spellEnd"/>
+      <w:r>
+        <w:rPr>
+          <w:rFonts w:ascii="Courier New" w:hAnsi="Courier New" w:cs="Courier New"/>
+          <w:sz w:val="16"/>
+          <w:szCs w:val="16"/>
+        </w:rPr>
+        <w:t xml:space="preserve"> CRTGEOMETRY</w:t>
+      </w:r>
+    </w:p>
+    <w:p>
+      <w:pPr>
+        <w:pStyle w:val="PlainText"/>
+        <w:rPr>
+          <w:rFonts w:ascii="Courier New" w:hAnsi="Courier New" w:cs="Courier New"/>
+          <w:sz w:val="16"/>
+          <w:szCs w:val="16"/>
+        </w:rPr>
+      </w:pPr>
+      <w:r>
+        <w:rPr>
+          <w:rFonts w:ascii="Courier New" w:hAnsi="Courier New" w:cs="Courier New"/>
+          <w:sz w:val="16"/>
+          <w:szCs w:val="16"/>
+        </w:rPr>
+        <w:t xml:space="preserve">                Configure x-window screen geometry as &lt;width&gt;x&lt;height&gt;{+-}&lt;</w:t>
+      </w:r>
+      <w:proofErr w:type="spellStart"/>
+      <w:r>
+        <w:rPr>
+          <w:rFonts w:ascii="Courier New" w:hAnsi="Courier New" w:cs="Courier New"/>
+          <w:sz w:val="16"/>
+          <w:szCs w:val="16"/>
+        </w:rPr>
+        <w:t>xoffset</w:t>
+      </w:r>
+      <w:proofErr w:type="spellEnd"/>
+      <w:r>
+        <w:rPr>
+          <w:rFonts w:ascii="Courier New" w:hAnsi="Courier New" w:cs="Courier New"/>
+          <w:sz w:val="16"/>
+          <w:szCs w:val="16"/>
+        </w:rPr>
+        <w:t>&gt;{+-}&lt;</w:t>
+      </w:r>
+      <w:proofErr w:type="spellStart"/>
+      <w:r>
+        <w:rPr>
+          <w:rFonts w:ascii="Courier New" w:hAnsi="Courier New" w:cs="Courier New"/>
+          <w:sz w:val="16"/>
+          <w:szCs w:val="16"/>
+        </w:rPr>
+        <w:t>yoffset</w:t>
+      </w:r>
+      <w:proofErr w:type="spellEnd"/>
+      <w:r>
+        <w:rPr>
+          <w:rFonts w:ascii="Courier New" w:hAnsi="Courier New" w:cs="Courier New"/>
+          <w:sz w:val="16"/>
+          <w:szCs w:val="16"/>
+        </w:rPr>
+        <w:t>&gt;</w:t>
+      </w:r>
+    </w:p>
+    <w:p>
+      <w:r>
+        <w:t>The geometry argument gives the size and position on the screen.  For a dual-CRT, an increasing x offset will shift the windows from the left screen onto the right screen.</w:t>
+      </w:r>
+    </w:p>
+    <w:p/>
+    <w:p>
+      <w:pPr>
         <w:pStyle w:val="Heading3"/>
       </w:pPr>
       <w:bookmarkStart w:id="34" w:name="_Toc187018297"/>
@@ -21830,7 +22100,6 @@
       </w:pPr>
       <w:bookmarkStart w:id="35" w:name="_Toc187018298"/>
       <w:r>
-        <w:lastRenderedPageBreak/>
         <w:t>Specialized</w:t>
       </w:r>
       <w:bookmarkEnd w:id="35"/>
@@ -22074,6 +22343,7 @@
         <w:rPr>
           <w:noProof/>
         </w:rPr>
+        <w:lastRenderedPageBreak/>
         <mc:AlternateContent>
           <mc:Choice Requires="wpc">
             <w:drawing>
@@ -22190,7 +22460,6 @@
     </w:p>
     <w:p>
       <w:r>
-        <w:lastRenderedPageBreak/>
         <w:t>The next block of indicators shows the state of various registers, including Accumulator, B Register, AR and Program Counter.  The row of switches gives a preset value for the Program Counter, used by Start Over (below).  By default, the simulator sets the PC Preset switches to the Jump-To address if there is one in the core file.</w:t>
       </w:r>
     </w:p>
@@ -22357,6 +22626,7 @@
     </w:p>
     <w:p>
       <w:r>
+        <w:lastRenderedPageBreak/>
         <w:t>The Examine button only works when the machine is Stopped, and reads the memory location corresponding to the PC Preset register, leaving the result in the PAR/MDR</w:t>
       </w:r>
       <w:r>
@@ -22491,11 +22761,7 @@
         <w:t>much</w:t>
       </w:r>
       <w:r>
-        <w:t xml:space="preserve"> simpler than conventional raster graphics devices, simply using a pair of D/A converters to position a beam on an x-y oscilloscope display, with a single bit for each ‘scope to turn the beam on and off.  As a result, the WW programmer is responsible for </w:t>
-      </w:r>
-      <w:r>
-        <w:lastRenderedPageBreak/>
-        <w:t>repainting the display often enough to keep the flicker down to an acceptable level.  Real-time programming indeed.</w:t>
+        <w:t xml:space="preserve"> simpler than conventional raster graphics devices, simply using a pair of D/A converters to position a beam on an x-y oscilloscope display, with a single bit for each ‘scope to turn the beam on and off.  As a result, the WW programmer is responsible for repainting the display often enough to keep the flicker down to an acceptable level.  Real-time programming indeed.</w:t>
       </w:r>
     </w:p>
     <w:p>
@@ -22587,7 +22853,11 @@
       </w:r>
       <w:proofErr w:type="spellEnd"/>
       <w:r>
-        <w:t>” hardware interface, which drives one or more analog oscilloscopes, using circuitry much closer to the “real” Whirlwind.</w:t>
+        <w:t xml:space="preserve">” hardware interface, which drives one or more analog oscilloscopes, using circuitry much closer to the “real” </w:t>
+      </w:r>
+      <w:r>
+        <w:lastRenderedPageBreak/>
+        <w:t>Whirlwind.</w:t>
       </w:r>
       <w:r>
         <w:t xml:space="preserve">  This interface also includes a physical Light Gun that senses points drawn on the CRT in the same way the real WW did.</w:t>
@@ -22730,7 +23000,6 @@
       <w:bookmarkStart w:id="50" w:name="_Toc187018310"/>
       <w:proofErr w:type="spellStart"/>
       <w:r>
-        <w:lastRenderedPageBreak/>
         <w:t>wwutd</w:t>
       </w:r>
       <w:proofErr w:type="spellEnd"/>
@@ -22884,7 +23153,7 @@
       <w:rPr>
         <w:noProof/>
       </w:rPr>
-      <w:t>April 25, 2026</w:t>
+      <w:t>May 13, 2026</w:t>
     </w:r>
     <w:r>
       <w:fldChar w:fldCharType="end"/>
@@ -26369,6 +26638,7 @@
   <w:style w:type="character" w:default="1" w:styleId="DefaultParagraphFont">
     <w:name w:val="Default Paragraph Font"/>
     <w:uiPriority w:val="1"/>
+    <w:semiHidden/>
     <w:unhideWhenUsed/>
   </w:style>
   <w:style w:type="table" w:default="1" w:styleId="TableNormal">

</xml_diff>